<commit_message>
Insert 6 dashboard screenshots with captions into informe.docx
</commit_message>
<xml_diff>
--- a/informe.docx
+++ b/informe.docx
@@ -629,6 +629,120 @@
           <w:rFonts w:ascii="Calibri" w:hAnsi="Calibri" w:eastAsia="Calibri" w:cs="Calibri"/>
         </w:rPr>
         <w:t xml:space="preserve"> - Poblacion total.</w:t>
+      </w:r>
+    </w:p>
+    <w:p>
+      <w:pPr>
+        <w:spacing w:line="276" w:lineRule="auto" w:before="120" w:after="40"/>
+        <w:jc w:val="center"/>
+      </w:pPr>
+      <w:r>
+        <w:rPr>
+          <w:rFonts w:ascii="Calibri" w:hAnsi="Calibri" w:eastAsia="Calibri" w:cs="Calibri"/>
+        </w:rPr>
+        <w:drawing>
+          <wp:inline xmlns:a="http://schemas.openxmlformats.org/drawingml/2006/main" xmlns:pic="http://schemas.openxmlformats.org/drawingml/2006/picture">
+            <wp:extent cx="5400000" cy="2739531"/>
+            <wp:docPr id="2" name="Picture 2"/>
+            <wp:cNvGraphicFramePr>
+              <a:graphicFrameLocks noChangeAspect="1"/>
+            </wp:cNvGraphicFramePr>
+            <a:graphic>
+              <a:graphicData uri="http://schemas.openxmlformats.org/drawingml/2006/picture">
+                <pic:pic>
+                  <pic:nvPicPr>
+                    <pic:cNvPr id="0" name="imagen1.PNG"/>
+                    <pic:cNvPicPr/>
+                  </pic:nvPicPr>
+                  <pic:blipFill>
+                    <a:blip r:embed="rId12"/>
+                    <a:stretch>
+                      <a:fillRect/>
+                    </a:stretch>
+                  </pic:blipFill>
+                  <pic:spPr>
+                    <a:xfrm>
+                      <a:off x="0" y="0"/>
+                      <a:ext cx="5400000" cy="2739531"/>
+                    </a:xfrm>
+                    <a:prstGeom prst="rect"/>
+                  </pic:spPr>
+                </pic:pic>
+              </a:graphicData>
+            </a:graphic>
+          </wp:inline>
+        </w:drawing>
+      </w:r>
+    </w:p>
+    <w:p>
+      <w:pPr>
+        <w:spacing w:line="276" w:lineRule="auto" w:after="200"/>
+        <w:jc w:val="center"/>
+      </w:pPr>
+      <w:r>
+        <w:rPr>
+          <w:rFonts w:ascii="Calibri" w:hAnsi="Calibri" w:eastAsia="Calibri" w:cs="Calibri"/>
+          <w:i/>
+          <w:sz w:val="20"/>
+        </w:rPr>
+        <w:t>Figura 1. Vista general del dashboard: filtros, KPIs y panel principal.</w:t>
+      </w:r>
+    </w:p>
+    <w:p>
+      <w:pPr>
+        <w:spacing w:line="276" w:lineRule="auto" w:before="120" w:after="40"/>
+        <w:jc w:val="center"/>
+      </w:pPr>
+      <w:r>
+        <w:rPr>
+          <w:rFonts w:ascii="Calibri" w:hAnsi="Calibri" w:eastAsia="Calibri" w:cs="Calibri"/>
+        </w:rPr>
+        <w:drawing>
+          <wp:inline xmlns:a="http://schemas.openxmlformats.org/drawingml/2006/main" xmlns:pic="http://schemas.openxmlformats.org/drawingml/2006/picture">
+            <wp:extent cx="5400000" cy="2407947"/>
+            <wp:docPr id="3" name="Picture 3"/>
+            <wp:cNvGraphicFramePr>
+              <a:graphicFrameLocks noChangeAspect="1"/>
+            </wp:cNvGraphicFramePr>
+            <a:graphic>
+              <a:graphicData uri="http://schemas.openxmlformats.org/drawingml/2006/picture">
+                <pic:pic>
+                  <pic:nvPicPr>
+                    <pic:cNvPr id="0" name="imagen6.PNG"/>
+                    <pic:cNvPicPr/>
+                  </pic:nvPicPr>
+                  <pic:blipFill>
+                    <a:blip r:embed="rId13"/>
+                    <a:stretch>
+                      <a:fillRect/>
+                    </a:stretch>
+                  </pic:blipFill>
+                  <pic:spPr>
+                    <a:xfrm>
+                      <a:off x="0" y="0"/>
+                      <a:ext cx="5400000" cy="2407947"/>
+                    </a:xfrm>
+                    <a:prstGeom prst="rect"/>
+                  </pic:spPr>
+                </pic:pic>
+              </a:graphicData>
+            </a:graphic>
+          </wp:inline>
+        </w:drawing>
+      </w:r>
+    </w:p>
+    <w:p>
+      <w:pPr>
+        <w:spacing w:line="276" w:lineRule="auto" w:after="200"/>
+        <w:jc w:val="center"/>
+      </w:pPr>
+      <w:r>
+        <w:rPr>
+          <w:rFonts w:ascii="Calibri" w:hAnsi="Calibri" w:eastAsia="Calibri" w:cs="Calibri"/>
+          <w:i/>
+          <w:sz w:val="20"/>
+        </w:rPr>
+        <w:t>Figura 2. Tabla de datos filtrados exportable a CSV.</w:t>
       </w:r>
     </w:p>
     <w:p>
@@ -1001,6 +1115,120 @@
     </w:p>
     <w:p>
       <w:pPr>
+        <w:spacing w:line="276" w:lineRule="auto" w:before="120" w:after="40"/>
+        <w:jc w:val="center"/>
+      </w:pPr>
+      <w:r>
+        <w:rPr>
+          <w:rFonts w:ascii="Calibri" w:hAnsi="Calibri" w:eastAsia="Calibri" w:cs="Calibri"/>
+        </w:rPr>
+        <w:drawing>
+          <wp:inline xmlns:a="http://schemas.openxmlformats.org/drawingml/2006/main" xmlns:pic="http://schemas.openxmlformats.org/drawingml/2006/picture">
+            <wp:extent cx="5400000" cy="2711859"/>
+            <wp:docPr id="4" name="Picture 4"/>
+            <wp:cNvGraphicFramePr>
+              <a:graphicFrameLocks noChangeAspect="1"/>
+            </wp:cNvGraphicFramePr>
+            <a:graphic>
+              <a:graphicData uri="http://schemas.openxmlformats.org/drawingml/2006/picture">
+                <pic:pic>
+                  <pic:nvPicPr>
+                    <pic:cNvPr id="0" name="imagen2.PNG"/>
+                    <pic:cNvPicPr/>
+                  </pic:nvPicPr>
+                  <pic:blipFill>
+                    <a:blip r:embed="rId14"/>
+                    <a:stretch>
+                      <a:fillRect/>
+                    </a:stretch>
+                  </pic:blipFill>
+                  <pic:spPr>
+                    <a:xfrm>
+                      <a:off x="0" y="0"/>
+                      <a:ext cx="5400000" cy="2711859"/>
+                    </a:xfrm>
+                    <a:prstGeom prst="rect"/>
+                  </pic:spPr>
+                </pic:pic>
+              </a:graphicData>
+            </a:graphic>
+          </wp:inline>
+        </w:drawing>
+      </w:r>
+    </w:p>
+    <w:p>
+      <w:pPr>
+        <w:spacing w:line="276" w:lineRule="auto" w:after="200"/>
+        <w:jc w:val="center"/>
+      </w:pPr>
+      <w:r>
+        <w:rPr>
+          <w:rFonts w:ascii="Calibri" w:hAnsi="Calibri" w:eastAsia="Calibri" w:cs="Calibri"/>
+          <w:i/>
+          <w:sz w:val="20"/>
+        </w:rPr>
+        <w:t>Figura 3. Scatter animado PIB vs CO2 (izquierda) y choropleth mundial (derecha).</w:t>
+      </w:r>
+    </w:p>
+    <w:p>
+      <w:pPr>
+        <w:spacing w:line="276" w:lineRule="auto" w:before="120" w:after="40"/>
+        <w:jc w:val="center"/>
+      </w:pPr>
+      <w:r>
+        <w:rPr>
+          <w:rFonts w:ascii="Calibri" w:hAnsi="Calibri" w:eastAsia="Calibri" w:cs="Calibri"/>
+        </w:rPr>
+        <w:drawing>
+          <wp:inline xmlns:a="http://schemas.openxmlformats.org/drawingml/2006/main" xmlns:pic="http://schemas.openxmlformats.org/drawingml/2006/picture">
+            <wp:extent cx="5400000" cy="2438710"/>
+            <wp:docPr id="5" name="Picture 5"/>
+            <wp:cNvGraphicFramePr>
+              <a:graphicFrameLocks noChangeAspect="1"/>
+            </wp:cNvGraphicFramePr>
+            <a:graphic>
+              <a:graphicData uri="http://schemas.openxmlformats.org/drawingml/2006/picture">
+                <pic:pic>
+                  <pic:nvPicPr>
+                    <pic:cNvPr id="0" name="imagen3.PNG"/>
+                    <pic:cNvPicPr/>
+                  </pic:nvPicPr>
+                  <pic:blipFill>
+                    <a:blip r:embed="rId15"/>
+                    <a:stretch>
+                      <a:fillRect/>
+                    </a:stretch>
+                  </pic:blipFill>
+                  <pic:spPr>
+                    <a:xfrm>
+                      <a:off x="0" y="0"/>
+                      <a:ext cx="5400000" cy="2438710"/>
+                    </a:xfrm>
+                    <a:prstGeom prst="rect"/>
+                  </pic:spPr>
+                </pic:pic>
+              </a:graphicData>
+            </a:graphic>
+          </wp:inline>
+        </w:drawing>
+      </w:r>
+    </w:p>
+    <w:p>
+      <w:pPr>
+        <w:spacing w:line="276" w:lineRule="auto" w:after="200"/>
+        <w:jc w:val="center"/>
+      </w:pPr>
+      <w:r>
+        <w:rPr>
+          <w:rFonts w:ascii="Calibri" w:hAnsi="Calibri" w:eastAsia="Calibri" w:cs="Calibri"/>
+          <w:i/>
+          <w:sz w:val="20"/>
+        </w:rPr>
+        <w:t>Figura 4. Tendencia temporal de emisiones de CO2 por continente.</w:t>
+      </w:r>
+    </w:p>
+    <w:p>
+      <w:pPr>
         <w:spacing w:before="280" w:after="160" w:line="276" w:lineRule="auto"/>
       </w:pPr>
       <w:r>
@@ -1167,6 +1395,63 @@
           <w:rFonts w:ascii="Calibri" w:hAnsi="Calibri" w:eastAsia="Calibri" w:cs="Calibri"/>
         </w:rPr>
         <w:t>inente y se calcula el promedio de CO2 per capita, promedio de PIB per capita y suma total de CO2 en Mt. Esto reduce la cardinalidad antes de la inferencia y mejora el costo y la latencia de la llamada.</w:t>
+      </w:r>
+    </w:p>
+    <w:p>
+      <w:pPr>
+        <w:spacing w:line="276" w:lineRule="auto" w:before="120" w:after="40"/>
+        <w:jc w:val="center"/>
+      </w:pPr>
+      <w:r>
+        <w:rPr>
+          <w:rFonts w:ascii="Calibri" w:hAnsi="Calibri" w:eastAsia="Calibri" w:cs="Calibri"/>
+        </w:rPr>
+        <w:drawing>
+          <wp:inline xmlns:a="http://schemas.openxmlformats.org/drawingml/2006/main" xmlns:pic="http://schemas.openxmlformats.org/drawingml/2006/picture">
+            <wp:extent cx="5400000" cy="2450952"/>
+            <wp:docPr id="6" name="Picture 6"/>
+            <wp:cNvGraphicFramePr>
+              <a:graphicFrameLocks noChangeAspect="1"/>
+            </wp:cNvGraphicFramePr>
+            <a:graphic>
+              <a:graphicData uri="http://schemas.openxmlformats.org/drawingml/2006/picture">
+                <pic:pic>
+                  <pic:nvPicPr>
+                    <pic:cNvPr id="0" name="imagen5.PNG"/>
+                    <pic:cNvPicPr/>
+                  </pic:nvPicPr>
+                  <pic:blipFill>
+                    <a:blip r:embed="rId16"/>
+                    <a:stretch>
+                      <a:fillRect/>
+                    </a:stretch>
+                  </pic:blipFill>
+                  <pic:spPr>
+                    <a:xfrm>
+                      <a:off x="0" y="0"/>
+                      <a:ext cx="5400000" cy="2450952"/>
+                    </a:xfrm>
+                    <a:prstGeom prst="rect"/>
+                  </pic:spPr>
+                </pic:pic>
+              </a:graphicData>
+            </a:graphic>
+          </wp:inline>
+        </w:drawing>
+      </w:r>
+    </w:p>
+    <w:p>
+      <w:pPr>
+        <w:spacing w:line="276" w:lineRule="auto" w:after="200"/>
+        <w:jc w:val="center"/>
+      </w:pPr>
+      <w:r>
+        <w:rPr>
+          <w:rFonts w:ascii="Calibri" w:hAnsi="Calibri" w:eastAsia="Calibri" w:cs="Calibri"/>
+          <w:i/>
+          <w:sz w:val="20"/>
+        </w:rPr>
+        <w:t>Figura 5. Datos agregados por continente enviados como contexto al modelo de lenguaje.</w:t>
       </w:r>
     </w:p>
     <w:p>
@@ -1277,6 +1562,63 @@
           <w:rFonts w:ascii="Calibri" w:hAnsi="Calibri" w:eastAsia="Calibri" w:cs="Calibri"/>
         </w:rPr>
         <w:t>os datos efectivamente filtrados. Si no cuentas con API key, el modo demo local genera un resumen estadistico equivalente.</w:t>
+      </w:r>
+    </w:p>
+    <w:p>
+      <w:pPr>
+        <w:spacing w:line="276" w:lineRule="auto" w:before="120" w:after="40"/>
+        <w:jc w:val="center"/>
+      </w:pPr>
+      <w:r>
+        <w:rPr>
+          <w:rFonts w:ascii="Calibri" w:hAnsi="Calibri" w:eastAsia="Calibri" w:cs="Calibri"/>
+        </w:rPr>
+        <w:drawing>
+          <wp:inline xmlns:a="http://schemas.openxmlformats.org/drawingml/2006/main" xmlns:pic="http://schemas.openxmlformats.org/drawingml/2006/picture">
+            <wp:extent cx="5400000" cy="2541874"/>
+            <wp:docPr id="7" name="Picture 7"/>
+            <wp:cNvGraphicFramePr>
+              <a:graphicFrameLocks noChangeAspect="1"/>
+            </wp:cNvGraphicFramePr>
+            <a:graphic>
+              <a:graphicData uri="http://schemas.openxmlformats.org/drawingml/2006/picture">
+                <pic:pic>
+                  <pic:nvPicPr>
+                    <pic:cNvPr id="0" name="imagen4.PNG"/>
+                    <pic:cNvPicPr/>
+                  </pic:nvPicPr>
+                  <pic:blipFill>
+                    <a:blip r:embed="rId17"/>
+                    <a:stretch>
+                      <a:fillRect/>
+                    </a:stretch>
+                  </pic:blipFill>
+                  <pic:spPr>
+                    <a:xfrm>
+                      <a:off x="0" y="0"/>
+                      <a:ext cx="5400000" cy="2541874"/>
+                    </a:xfrm>
+                    <a:prstGeom prst="rect"/>
+                  </pic:spPr>
+                </pic:pic>
+              </a:graphicData>
+            </a:graphic>
+          </wp:inline>
+        </w:drawing>
+      </w:r>
+    </w:p>
+    <w:p>
+      <w:pPr>
+        <w:spacing w:line="276" w:lineRule="auto" w:after="200"/>
+        <w:jc w:val="center"/>
+      </w:pPr>
+      <w:r>
+        <w:rPr>
+          <w:rFonts w:ascii="Calibri" w:hAnsi="Calibri" w:eastAsia="Calibri" w:cs="Calibri"/>
+          <w:i/>
+          <w:sz w:val="20"/>
+        </w:rPr>
+        <w:t>Figura 6. Panel de narrativa con IA: prompt editable y resumen ejecutivo generado.</w:t>
       </w:r>
     </w:p>
     <w:p>

</xml_diff>